<commit_message>
feat(ventas): avisos BIA/Rentek, cotización por sedes y formato de cotización
Marca cada equipo como BIA (vendible) o Rentek (no vendible) y bloquea la cotización de equipos Rentek hasta quitarlos o aceptar la advertencia. Permite cotizar varias sedes de una misma compañía buscando por razón social. Corrige el formato del documento de cotización: títulos sin pipes, "cliente" en minúscula, "Señores: <empresa>" en una línea y fecha con mes en minúscula sin partirse.
</commit_message>
<xml_diff>
--- a/assets/cotizacion_template.docx
+++ b/assets/cotizacion_template.docx
@@ -394,7 +394,28 @@
           <w:vertAlign w:val="baseline"/>
           <w:rtl w:val="0"/>
         </w:rPr>
-        <w:t xml:space="preserve">Señores</w:t>
+        <w:t xml:space="preserve">Señores: </w:t>
+      </w:r>
+      <w:r>
+        <w:rPr>
+          <w:b w:val="1"/>
+          <w:bCs w:val="1"/>
+          <w:rFonts w:ascii="Verdana" w:cs="Verdana" w:eastAsia="Verdana" w:hAnsi="Verdana"/>
+          <w:b w:val="0"/>
+          <w:bCs w:val="0"/>
+          <w:i w:val="0"/>
+          <w:iCs w:val="0"/>
+          <w:smallCaps w:val="0"/>
+          <w:strike w:val="0"/>
+          <w:color w:val="000000"/>
+          <w:sz w:val="22"/>
+          <w:szCs w:val="22"/>
+          <w:u w:val="none"/>
+          <w:shd w:fill="auto" w:val="clear"/>
+          <w:vertAlign w:val="baseline"/>
+          <w:rtl w:val="0"/>
+        </w:rPr>
+        <w:t xml:space="preserve">{razon_social}</w:t>
       </w:r>
     </w:p>
     <w:p>
@@ -417,34 +438,6 @@
       </w:pPr>
       <w:r>
         <w:br w:type="column"/>
-      </w:r>
-      <w:r>
-        <w:rPr>
-          <w:rtl w:val="0"/>
-        </w:rPr>
-      </w:r>
-    </w:p>
-    <w:p>
-      <w:pPr>
-        <w:pStyle w:val="Heading1"/>
-        <w:spacing w:before="41" w:lineRule="auto"/>
-        <w:ind w:firstLine="1701"/>
-        <w:rPr>
-          <w:smallCaps w:val="0"/>
-          <w:strike w:val="0"/>
-          <w:color w:val="000000"/>
-          <w:sz w:val="22"/>
-          <w:szCs w:val="22"/>
-          <w:u w:val="none"/>
-          <w:shd w:fill="auto" w:val="clear"/>
-          <w:vertAlign w:val="baseline"/>
-        </w:rPr>
-      </w:pPr>
-      <w:r>
-        <w:rPr>
-          <w:rtl w:val="0"/>
-        </w:rPr>
-        <w:t xml:space="preserve">{razon_social}</w:t>
       </w:r>
       <w:r>
         <w:rPr>
@@ -834,7 +827,7 @@
         <w:rPr>
           <w:rtl w:val="0"/>
         </w:rPr>
-        <w:t xml:space="preserve">|OFERTA ECONÓMICA|</w:t>
+        <w:t xml:space="preserve">OFERTA ECONÓMICA</w:t>
       </w:r>
     </w:p>
     <w:p>
@@ -1528,7 +1521,7 @@
         <w:rPr>
           <w:rtl w:val="0"/>
         </w:rPr>
-        <w:t xml:space="preserve">El Cliente deberá asumir los siguientes costos: </w:t>
+        <w:t xml:space="preserve">El cliente deberá asumir los siguientes costos: </w:t>
       </w:r>
       <w:r>
         <w:rPr>
@@ -1605,7 +1598,7 @@
         <w:rPr>
           <w:rtl w:val="0"/>
         </w:rPr>
-        <w:t xml:space="preserve">|FORMA DE PAGO|</w:t>
+        <w:t xml:space="preserve">FORMA DE PAGO</w:t>
       </w:r>
     </w:p>
     <w:p>

</xml_diff>